<commit_message>
Reframe website feedback doc as raw material, not directives (drop 'Implication' lines + priority list)
</commit_message>
<xml_diff>
--- a/audit/website-feedback-for-arnob.docx
+++ b/audit/website-feedback-for-arnob.docx
@@ -10,7 +10,7 @@
         <w:rPr>
           <w:sz w:val="44"/>
         </w:rPr>
-        <w:t>Founder Folks website — collated feedback for Arnob</w:t>
+        <w:t>Founder Folks website — feedback we've received</w:t>
       </w:r>
     </w:p>
     <w:p>
@@ -18,13 +18,13 @@
         <w:spacing w:after="120"/>
       </w:pPr>
       <w:r>
-        <w:t xml:space="preserve">Scope: </w:t>
+        <w:t xml:space="preserve">Raw material, not a brief. This is a collation of the feedback we've picked up on the main site so far, so we've got it in one place before we sit down to decide what to change. Scope: </w:t>
       </w:r>
       <w:r>
         <w:rPr>
           <w:i/>
         </w:rPr>
-        <w:t>*Main site only</w:t>
+        <w:t>*main site only</w:t>
       </w:r>
       <w:r>
         <w:t>* (</w:t>
@@ -87,7 +87,7 @@
         <w:t>*Siddharth</w:t>
       </w:r>
       <w:r>
-        <w:t>* — Sep 14, landing-page review (recorded as "main landing," reviewed separately from the playbook)</w:t>
+        <w:t>* — Sep 14, landing-page review (reviewed separately from the playbook)</w:t>
       </w:r>
     </w:p>
     <w:p>
@@ -151,7 +151,7 @@
         <w:spacing w:after="120"/>
       </w:pPr>
       <w:r>
-        <w:t>Where feedback overlapped across two or more people, we've merged it and kept every original quote. Where a single voice made a call, the person is named. This is for shipping, not summary — Arnob should read the whole thing.</w:t>
+        <w:t>Where feedback overlapped across two or more people, it's grouped and every original quote is preserved. Where a single voice made a call, the person is named. Nothing here is a decision — it's what we've been told.</w:t>
       </w:r>
     </w:p>
     <w:p>
@@ -375,24 +375,10 @@
         <w:rPr>
           <w:i/>
         </w:rPr>
-        <w:t xml:space="preserve"> (Also a visual-lag/perf issue she flagged: </w:t>
+        <w:t xml:space="preserve"> (Also a visual-lag / perf issue she flagged: </w:t>
       </w:r>
       <w:r>
         <w:t>"my other pages are not lagging, so… maybe it's the website. It could be the website is a little heavy. I'll look into that."*)</w:t>
-      </w:r>
-    </w:p>
-    <w:p>
-      <w:pPr>
-        <w:spacing w:after="120"/>
-      </w:pPr>
-      <w:r>
-        <w:rPr>
-          <w:i/>
-        </w:rPr>
-        <w:t>*Implication:</w:t>
-      </w:r>
-      <w:r>
-        <w:t>* Reduce the explanatory block right below the hero. Replace with immediate proof / momentum. Fix the sticky-scroll pacing and rework the plane-over-building visual so a cold visitor understands the story without prior context.</w:t>
       </w:r>
     </w:p>
     <w:p>
@@ -416,7 +402,7 @@
           <w:color w:val="1A1A1A"/>
           <w:sz w:val="30"/>
         </w:rPr>
-        <w:t>2. Lead with the transformation. Say what the site does before you explain the problem.</w:t>
+        <w:t>2. Feedback on hero copy specifically</w:t>
       </w:r>
     </w:p>
     <w:p>
@@ -474,7 +460,7 @@
         <w:t xml:space="preserve"> — the page relies on prior verbal context. The team agreed: </w:t>
       </w:r>
       <w:r>
-        <w:t>"only because we mentioned it to him, he knows we're helping that."* Fix could be as small as one extra line making scope explicit.</w:t>
+        <w:t>"only because we mentioned it to him, he knows we're helping that."* Suggestion was as small as one extra line making scope explicit.</w:t>
       </w:r>
     </w:p>
     <w:p>
@@ -548,26 +534,6 @@
     </w:p>
     <w:p>
       <w:pPr>
-        <w:spacing w:after="120"/>
-      </w:pPr>
-      <w:r>
-        <w:rPr>
-          <w:i/>
-        </w:rPr>
-        <w:t>*Implication:</w:t>
-      </w:r>
-      <w:r>
-        <w:rPr>
-          <w:i/>
-        </w:rPr>
-        <w:t xml:space="preserve"> Rewrite the hero copy so the first sentence names the transformation ("we help X get to Y"), the second names </w:t>
-      </w:r>
-      <w:r>
-        <w:t>what we do*, and the third names the problem. Cut the cinematic framing. Consider the "Talent, access, capital" trio as the anchor line.</w:t>
-      </w:r>
-    </w:p>
-    <w:p>
-      <w:pPr>
         <w:spacing w:before="120" w:after="120"/>
         <w:jc w:val="center"/>
       </w:pPr>
@@ -587,7 +553,7 @@
           <w:color w:val="1A1A1A"/>
           <w:sz w:val="30"/>
         </w:rPr>
-        <w:t>3. The site currently shows great design and does not yet earn trust.</w:t>
+        <w:t>3. Design is loved. Trust isn't earned yet.</w:t>
       </w:r>
     </w:p>
     <w:p>
@@ -595,7 +561,7 @@
         <w:spacing w:after="120"/>
       </w:pPr>
       <w:r>
-        <w:t>This was the single loudest point in the Mrinali review. Every reviewer downstream restated it in a different form.</w:t>
+        <w:t>The loudest theme in the Mrinali review, restated in different forms by others.</w:t>
       </w:r>
     </w:p>
     <w:p>
@@ -709,20 +675,6 @@
     </w:p>
     <w:p>
       <w:pPr>
-        <w:spacing w:after="120"/>
-      </w:pPr>
-      <w:r>
-        <w:rPr>
-          <w:i/>
-        </w:rPr>
-        <w:t>*Implication:</w:t>
-      </w:r>
-      <w:r>
-        <w:t>* Product Folks' scale and track record needs to be central to the story, not a footnote. Add relevant logos, proof points, founder backgrounds (Suhas + Shonik), and tangible signals of the network / access we bring. Founder cards or bylines above the fold. If we've placed 5 founders already, name them (or their status) somewhere prominent.</w:t>
-      </w:r>
-    </w:p>
-    <w:p>
-      <w:pPr>
         <w:spacing w:before="120" w:after="120"/>
         <w:jc w:val="center"/>
       </w:pPr>
@@ -742,7 +694,7 @@
           <w:color w:val="1A1A1A"/>
           <w:sz w:val="30"/>
         </w:rPr>
-        <w:t>4. Add scarcity and status. Show this is already underway.</w:t>
+        <w:t>4. Scarcity + status signals</w:t>
       </w:r>
     </w:p>
     <w:p>
@@ -816,20 +768,6 @@
     </w:p>
     <w:p>
       <w:pPr>
-        <w:spacing w:after="120"/>
-      </w:pPr>
-      <w:r>
-        <w:rPr>
-          <w:i/>
-        </w:rPr>
-        <w:t>*Implication:</w:t>
-      </w:r>
-      <w:r>
-        <w:t>* Put "5 of 20 founder spots filled" (or the current true count) high on the page. Where appropriate, show founder / company signals for the ones already in, and an open slot the visitor can imagine themselves in. Design the whole page for cold or lightly-warm visitors who need to understand and trust us without any prior context — not for people who already know Suhas.</w:t>
-      </w:r>
-    </w:p>
-    <w:p>
-      <w:pPr>
         <w:spacing w:before="120" w:after="120"/>
         <w:jc w:val="center"/>
       </w:pPr>
@@ -849,7 +787,7 @@
           <w:color w:val="1A1A1A"/>
           <w:sz w:val="30"/>
         </w:rPr>
-        <w:t>5. Positioning: invite-only, curated, not "community."</w:t>
+        <w:t>5. Positioning language: "community" vs invite-only</w:t>
       </w:r>
     </w:p>
     <w:p>
@@ -857,7 +795,7 @@
         <w:spacing w:after="120"/>
       </w:pPr>
       <w:r>
-        <w:t>Multiple reviewers pushed hard on this specific word.</w:t>
+        <w:t>Multiple reviewers pushed on this specific word.</w:t>
       </w:r>
     </w:p>
     <w:p>
@@ -1014,22 +952,916 @@
         <w:spacing w:after="120"/>
       </w:pPr>
       <w:r>
+        <w:t xml:space="preserve">On the application path, Founder Corridor session added: </w:t>
+      </w:r>
+      <w:r>
         <w:rPr>
           <w:i/>
         </w:rPr>
-        <w:t>*Implication:</w:t>
-      </w:r>
+        <w:t>"prefer simple referral-led wording — 'Get a referral from one of your network,' 'Connect with and convince any of our network' — and keep only the strongest single path rather than multiple options."</w:t>
+      </w:r>
+    </w:p>
+    <w:p>
+      <w:pPr>
+        <w:spacing w:before="120" w:after="120"/>
+        <w:jc w:val="center"/>
+      </w:pPr>
+      <w:r>
+        <w:rPr>
+          <w:color w:val="BBBBBB"/>
+        </w:rPr>
+        <w:t>――――――――――――――――――――――――――――――</w:t>
+      </w:r>
+    </w:p>
+    <w:p>
+      <w:pPr>
+        <w:pStyle w:val="Heading1"/>
+      </w:pPr>
+      <w:r>
+        <w:rPr>
+          <w:color w:val="1A1A1A"/>
+          <w:sz w:val="30"/>
+        </w:rPr>
+        <w:t>6. Feature / capability copy</w:t>
+      </w:r>
+    </w:p>
+    <w:p>
+      <w:pPr>
+        <w:pStyle w:val="ListBullet"/>
+      </w:pPr>
       <w:r>
         <w:rPr>
           <w:i/>
         </w:rPr>
-        <w:t xml:space="preserve"> Retire "community" as the primary descriptor everywhere except that one Shalaka-approved line, and lead with </w:t>
+        <w:t>*Mrinali:</w:t>
       </w:r>
       <w:r>
         <w:rPr>
           <w:i/>
         </w:rPr>
-        <w:t>invite-only membership</w:t>
+        <w:t xml:space="preserve"> </w:t>
+      </w:r>
+      <w:r>
+        <w:t>"Right now it is text that explains the title. I want it to be text that confirms the right."*</w:t>
+      </w:r>
+    </w:p>
+    <w:p>
+      <w:pPr>
+        <w:pStyle w:val="ListBullet"/>
+      </w:pPr>
+      <w:r>
+        <w:rPr>
+          <w:i/>
+        </w:rPr>
+        <w:t>*Mrinali:</w:t>
+      </w:r>
+      <w:r>
+        <w:rPr>
+          <w:i/>
+        </w:rPr>
+        <w:t xml:space="preserve"> </w:t>
+      </w:r>
+      <w:r>
+        <w:t>"Playbook to win. What works from those doing it now… you could say, like, we've studied how [XYZ], we know people from XYZ, so we know how to win… it pulls a bigger punch because right now it is text that explains the title."*</w:t>
+      </w:r>
+    </w:p>
+    <w:p>
+      <w:pPr>
+        <w:pStyle w:val="ListBullet"/>
+      </w:pPr>
+      <w:r>
+        <w:rPr>
+          <w:i/>
+        </w:rPr>
+        <w:t>*Mrinali:</w:t>
+      </w:r>
+      <w:r>
+        <w:rPr>
+          <w:i/>
+        </w:rPr>
+        <w:t xml:space="preserve"> </w:t>
+      </w:r>
+      <w:r>
+        <w:t>"Why we are the best people to do it."*</w:t>
+      </w:r>
+    </w:p>
+    <w:p>
+      <w:pPr>
+        <w:pStyle w:val="ListBullet"/>
+      </w:pPr>
+      <w:r>
+        <w:rPr>
+          <w:i/>
+        </w:rPr>
+        <w:t>*Mrinali summary line:</w:t>
+      </w:r>
+      <w:r>
+        <w:rPr>
+          <w:i/>
+        </w:rPr>
+        <w:t xml:space="preserve"> </w:t>
+      </w:r>
+      <w:r>
+        <w:t>"You're showing your rigor in what you're doing. Rather than, you know, talking that, hey, we are doing this."*</w:t>
+      </w:r>
+    </w:p>
+    <w:p>
+      <w:pPr>
+        <w:spacing w:before="120" w:after="120"/>
+        <w:jc w:val="center"/>
+      </w:pPr>
+      <w:r>
+        <w:rPr>
+          <w:color w:val="BBBBBB"/>
+        </w:rPr>
+        <w:t>――――――――――――――――――――――――――――――</w:t>
+      </w:r>
+    </w:p>
+    <w:p>
+      <w:pPr>
+        <w:pStyle w:val="Heading1"/>
+      </w:pPr>
+      <w:r>
+        <w:rPr>
+          <w:color w:val="1A1A1A"/>
+          <w:sz w:val="30"/>
+        </w:rPr>
+        <w:t>7. Founder Concierge — feedback specifically</w:t>
+      </w:r>
+    </w:p>
+    <w:p>
+      <w:pPr>
+        <w:pStyle w:val="ListBullet"/>
+      </w:pPr>
+      <w:r>
+        <w:rPr>
+          <w:i/>
+        </w:rPr>
+        <w:t>*Balu (Sep 3), unprompted:</w:t>
+      </w:r>
+      <w:r>
+        <w:rPr>
+          <w:i/>
+        </w:rPr>
+        <w:t xml:space="preserve"> </w:t>
+      </w:r>
+      <w:r>
+        <w:t>"Founder concierge as a service is a solid, solid proposition. Like people would pay just for that. Like they'll actually, like, drop a few thousand dollars on you if you can actually just pin that off into a service in itself."*</w:t>
+      </w:r>
+    </w:p>
+    <w:p>
+      <w:pPr>
+        <w:pStyle w:val="ListBullet"/>
+      </w:pPr>
+      <w:r>
+        <w:rPr>
+          <w:i/>
+        </w:rPr>
+        <w:t>*Balu's caveat about who "gets" it:</w:t>
+      </w:r>
+      <w:r>
+        <w:rPr>
+          <w:i/>
+        </w:rPr>
+        <w:t xml:space="preserve"> </w:t>
+      </w:r>
+      <w:r>
+        <w:t>"If someone has visited SF even once as a founder or some senior-level operator, then they would see the value of this even more… People have never been to SF simply assume that you can just walk into rooms and then meet everyone that you want. Only when they visit once they would see that. Yeah, you can walk in the rooms and meet people, but not the people you want. You'll just end up meeting, like, a lot of randoms."*</w:t>
+      </w:r>
+    </w:p>
+    <w:p>
+      <w:pPr>
+        <w:pStyle w:val="ListBullet"/>
+      </w:pPr>
+      <w:r>
+        <w:rPr>
+          <w:i/>
+        </w:rPr>
+        <w:t>*Siddharth on the concierge icons:</w:t>
+      </w:r>
+      <w:r>
+        <w:rPr>
+          <w:i/>
+        </w:rPr>
+        <w:t xml:space="preserve"> </w:t>
+      </w:r>
+      <w:r>
+        <w:t>"The only 2 things I can make out is this bridge and this trophy."*</w:t>
+      </w:r>
+    </w:p>
+    <w:p>
+      <w:pPr>
+        <w:spacing w:before="120" w:after="120"/>
+        <w:jc w:val="center"/>
+      </w:pPr>
+      <w:r>
+        <w:rPr>
+          <w:color w:val="BBBBBB"/>
+        </w:rPr>
+        <w:t>――――――――――――――――――――――――――――――</w:t>
+      </w:r>
+    </w:p>
+    <w:p>
+      <w:pPr>
+        <w:pStyle w:val="Heading1"/>
+      </w:pPr>
+      <w:r>
+        <w:rPr>
+          <w:color w:val="1A1A1A"/>
+          <w:sz w:val="30"/>
+        </w:rPr>
+        <w:t>8. The mission / manifesto section</w:t>
+      </w:r>
+    </w:p>
+    <w:p>
+      <w:pPr>
+        <w:pStyle w:val="ListBullet"/>
+      </w:pPr>
+      <w:r>
+        <w:rPr>
+          <w:i/>
+        </w:rPr>
+        <w:t>*Founder Corridor session:</w:t>
+      </w:r>
+      <w:r>
+        <w:rPr>
+          <w:i/>
+        </w:rPr>
+        <w:t xml:space="preserve"> </w:t>
+      </w:r>
+      <w:r>
+        <w:t>"The written version 'keeps repeating itself' and 'should not be this long at all' — 'it doesn't need like 8 sentences and like it's like a poem.'"*</w:t>
+      </w:r>
+    </w:p>
+    <w:p>
+      <w:pPr>
+        <w:pStyle w:val="ListBullet"/>
+      </w:pPr>
+      <w:r>
+        <w:rPr>
+          <w:i/>
+        </w:rPr>
+        <w:t>*Founder Corridor session:</w:t>
+      </w:r>
+      <w:r>
+        <w:rPr>
+          <w:i/>
+        </w:rPr>
+        <w:t xml:space="preserve"> </w:t>
+      </w:r>
+      <w:r>
+        <w:t>"It's not feeling genuine… it is feeling like you're trying too hard to convince these people that it's good."*</w:t>
+      </w:r>
+    </w:p>
+    <w:p>
+      <w:pPr>
+        <w:pStyle w:val="ListBullet"/>
+      </w:pPr>
+      <w:r>
+        <w:rPr>
+          <w:i/>
+        </w:rPr>
+        <w:t>*Founder Corridor session:</w:t>
+      </w:r>
+      <w:r>
+        <w:rPr>
+          <w:i/>
+        </w:rPr>
+        <w:t xml:space="preserve"> </w:t>
+      </w:r>
+      <w:r>
+        <w:t>"You have to be a little more confident. Optimize for brevity. Just say exactly what you're trying to say."*</w:t>
+      </w:r>
+    </w:p>
+    <w:p>
+      <w:pPr>
+        <w:pStyle w:val="ListBullet"/>
+      </w:pPr>
+      <w:r>
+        <w:rPr>
+          <w:i/>
+        </w:rPr>
+        <w:t>*Founder Corridor session:</w:t>
+      </w:r>
+      <w:r>
+        <w:rPr>
+          <w:i/>
+        </w:rPr>
+        <w:t xml:space="preserve"> </w:t>
+      </w:r>
+      <w:r>
+        <w:t>"The spoken version was preferred over the written copy: 'What you said was so much more clearer to me.'"*</w:t>
+      </w:r>
+    </w:p>
+    <w:p>
+      <w:pPr>
+        <w:pStyle w:val="ListBullet"/>
+      </w:pPr>
+      <w:r>
+        <w:rPr>
+          <w:i/>
+        </w:rPr>
+        <w:t>*Founder Corridor guiding principle:</w:t>
+      </w:r>
+      <w:r>
+        <w:rPr>
+          <w:i/>
+        </w:rPr>
+        <w:t xml:space="preserve"> </w:t>
+      </w:r>
+      <w:r>
+        <w:t>"You have to write like you speak. Only then confidence shows. If you write to impress somebody, it's not going to do that."*</w:t>
+      </w:r>
+    </w:p>
+    <w:p>
+      <w:pPr>
+        <w:pStyle w:val="ListBullet"/>
+      </w:pPr>
+      <w:r>
+        <w:rPr>
+          <w:i/>
+        </w:rPr>
+        <w:t>*Ishita on the same section:</w:t>
+      </w:r>
+      <w:r>
+        <w:rPr>
+          <w:i/>
+        </w:rPr>
+        <w:t xml:space="preserve"> </w:t>
+      </w:r>
+      <w:r>
+        <w:t>"I didn't like the wording of this. Maybe this is cloud generated… I would pick one really crisp angle because I feel like there were two, three different things communicated here,"</w:t>
+      </w:r>
+      <w:r>
+        <w:rPr>
+          <w:i/>
+        </w:rPr>
+        <w:t xml:space="preserve"> and </w:t>
+      </w:r>
+      <w:r>
+        <w:t>"There wasn't a message that kind of stayed in my head. Maybe make it crisper."*</w:t>
+      </w:r>
+    </w:p>
+    <w:p>
+      <w:pPr>
+        <w:pStyle w:val="ListBullet"/>
+      </w:pPr>
+      <w:r>
+        <w:rPr>
+          <w:i/>
+        </w:rPr>
+        <w:t>*Ishita on the framing option:</w:t>
+      </w:r>
+      <w:r>
+        <w:rPr>
+          <w:i/>
+        </w:rPr>
+        <w:t xml:space="preserve"> </w:t>
+      </w:r>
+      <w:r>
+        <w:t>"This will look like a scroll or a letter. Right. So this is more on here. This is like the memo that comes out in the beginning… why are we doing what we're doing? And it'll look like a written handwritten thing, basically."*</w:t>
+      </w:r>
+    </w:p>
+    <w:p>
+      <w:pPr>
+        <w:pStyle w:val="ListBullet"/>
+      </w:pPr>
+      <w:r>
+        <w:rPr>
+          <w:i/>
+        </w:rPr>
+        <w:t>*Shalaka:</w:t>
+      </w:r>
+      <w:r>
+        <w:rPr>
+          <w:i/>
+        </w:rPr>
+        <w:t xml:space="preserve"> </w:t>
+      </w:r>
+      <w:r>
+        <w:t>"The 'Building looks exciting from the outside' section could be tightened; there's more content than the point needs,"</w:t>
+      </w:r>
+      <w:r>
+        <w:rPr>
+          <w:i/>
+        </w:rPr>
+        <w:t xml:space="preserve"> and </w:t>
+      </w:r>
+      <w:r>
+        <w:t>"'Steal the structure, not the slides' is a strong line and worth building on further."*</w:t>
+      </w:r>
+    </w:p>
+    <w:p>
+      <w:pPr>
+        <w:spacing w:before="120" w:after="120"/>
+        <w:jc w:val="center"/>
+      </w:pPr>
+      <w:r>
+        <w:rPr>
+          <w:color w:val="BBBBBB"/>
+        </w:rPr>
+        <w:t>――――――――――――――――――――――――――――――</w:t>
+      </w:r>
+    </w:p>
+    <w:p>
+      <w:pPr>
+        <w:pStyle w:val="Heading1"/>
+      </w:pPr>
+      <w:r>
+        <w:rPr>
+          <w:color w:val="1A1A1A"/>
+          <w:sz w:val="30"/>
+        </w:rPr>
+        <w:t>9. AI-generated tone concern across the site</w:t>
+      </w:r>
+    </w:p>
+    <w:p>
+      <w:pPr>
+        <w:pStyle w:val="ListBullet"/>
+      </w:pPr>
+      <w:r>
+        <w:rPr>
+          <w:i/>
+        </w:rPr>
+        <w:t>*Catch: TFF (Jul 19):</w:t>
+      </w:r>
+      <w:r>
+        <w:rPr>
+          <w:i/>
+        </w:rPr>
+        <w:t xml:space="preserve"> </w:t>
+      </w:r>
+      <w:r>
+        <w:t>"Website copy is largely AI-generated; repeated worry: 'If it's just AI generated content, how valuable will it be?'"* Suggestion at the time was to humanize using different sources — Twitter bookmarks were shared via WhatsApp as raw material.</w:t>
+      </w:r>
+    </w:p>
+    <w:p>
+      <w:pPr>
+        <w:spacing w:before="120" w:after="120"/>
+        <w:jc w:val="center"/>
+      </w:pPr>
+      <w:r>
+        <w:rPr>
+          <w:color w:val="BBBBBB"/>
+        </w:rPr>
+        <w:t>――――――――――――――――――――――――――――――</w:t>
+      </w:r>
+    </w:p>
+    <w:p>
+      <w:pPr>
+        <w:pStyle w:val="Heading1"/>
+      </w:pPr>
+      <w:r>
+        <w:rPr>
+          <w:color w:val="1A1A1A"/>
+          <w:sz w:val="30"/>
+        </w:rPr>
+        <w:t>10. Homepage sections and structure</w:t>
+      </w:r>
+    </w:p>
+    <w:p>
+      <w:pPr>
+        <w:pStyle w:val="ListBullet"/>
+      </w:pPr>
+      <w:r>
+        <w:rPr>
+          <w:i/>
+        </w:rPr>
+        <w:t>*Siddharth:</w:t>
+      </w:r>
+      <w:r>
+        <w:rPr>
+          <w:i/>
+        </w:rPr>
+        <w:t xml:space="preserve"> Suggested surfacing the </w:t>
+      </w:r>
+      <w:r>
+        <w:rPr>
+          <w:i/>
+        </w:rPr>
+        <w:t>"before going to SF / after arriving"</w:t>
+      </w:r>
+      <w:r>
+        <w:rPr>
+          <w:i/>
+        </w:rPr>
+        <w:t xml:space="preserve"> split — three items each — directly on the homepage. He was specifically asked and explicitly said </w:t>
+      </w:r>
+      <w:r>
+        <w:t>"Homepage"</w:t>
+      </w:r>
+      <w:r>
+        <w:rPr>
+          <w:i/>
+        </w:rPr>
+        <w:t xml:space="preserve"> was where this belongs. Cover the biggest practical problems like housing and community so a founder can quickly judge </w:t>
+      </w:r>
+      <w:r>
+        <w:t>"is this useful to me or not?"*</w:t>
+      </w:r>
+    </w:p>
+    <w:p>
+      <w:pPr>
+        <w:pStyle w:val="ListBullet"/>
+      </w:pPr>
+      <w:r>
+        <w:rPr>
+          <w:i/>
+        </w:rPr>
+        <w:t>*Siddharth:</w:t>
+      </w:r>
+      <w:r>
+        <w:rPr>
+          <w:i/>
+        </w:rPr>
+        <w:t xml:space="preserve"> </w:t>
+      </w:r>
+      <w:r>
+        <w:t>"Make the experience reassuring for nervous first-time visitors to the US."*</w:t>
+      </w:r>
+    </w:p>
+    <w:p>
+      <w:pPr>
+        <w:pStyle w:val="ListBullet"/>
+      </w:pPr>
+      <w:r>
+        <w:rPr>
+          <w:i/>
+        </w:rPr>
+        <w:t>*Siddharth blunt verdict:</w:t>
+      </w:r>
+      <w:r>
+        <w:rPr>
+          <w:i/>
+        </w:rPr>
+        <w:t xml:space="preserve"> </w:t>
+      </w:r>
+      <w:r>
+        <w:t>"Our deck is more beautiful."* The current website falls short of the deck, in his view.</w:t>
+      </w:r>
+    </w:p>
+    <w:p>
+      <w:pPr>
+        <w:pStyle w:val="ListBullet"/>
+      </w:pPr>
+      <w:r>
+        <w:rPr>
+          <w:i/>
+        </w:rPr>
+        <w:t>*Ishita on the six-buckets / concierge section:</w:t>
+      </w:r>
+      <w:r>
+        <w:rPr>
+          <w:i/>
+        </w:rPr>
+        <w:t xml:space="preserve"> </w:t>
+      </w:r>
+      <w:r>
+        <w:t>"You could break it down here if, you know, you think this is also not clear enough."*</w:t>
+      </w:r>
+    </w:p>
+    <w:p>
+      <w:pPr>
+        <w:pStyle w:val="ListBullet"/>
+      </w:pPr>
+      <w:r>
+        <w:rPr>
+          <w:i/>
+        </w:rPr>
+        <w:t>*Ishita on the "support" wording:</w:t>
+      </w:r>
+      <w:r>
+        <w:rPr>
+          <w:i/>
+        </w:rPr>
+        <w:t xml:space="preserve"> </w:t>
+      </w:r>
+      <w:r>
+        <w:t>"Support seems to generate. Like, what do you mean support with…"* — the word "support" is doing too much work without specifics, in her read.</w:t>
+      </w:r>
+    </w:p>
+    <w:p>
+      <w:pPr>
+        <w:spacing w:before="120" w:after="120"/>
+        <w:jc w:val="center"/>
+      </w:pPr>
+      <w:r>
+        <w:rPr>
+          <w:color w:val="BBBBBB"/>
+        </w:rPr>
+        <w:t>――――――――――――――――――――――――――――――</w:t>
+      </w:r>
+    </w:p>
+    <w:p>
+      <w:pPr>
+        <w:pStyle w:val="Heading1"/>
+      </w:pPr>
+      <w:r>
+        <w:rPr>
+          <w:color w:val="1A1A1A"/>
+          <w:sz w:val="30"/>
+        </w:rPr>
+        <w:t>11. Logo animation</w:t>
+      </w:r>
+    </w:p>
+    <w:p>
+      <w:pPr>
+        <w:pStyle w:val="ListBullet"/>
+      </w:pPr>
+      <w:r>
+        <w:rPr>
+          <w:i/>
+        </w:rPr>
+        <w:t>*Shalaka:</w:t>
+      </w:r>
+      <w:r>
+        <w:rPr>
+          <w:i/>
+        </w:rPr>
+        <w:t xml:space="preserve"> </w:t>
+      </w:r>
+      <w:r>
+        <w:t>"The animation itself is lovely, but the F is hard to read once it's moving, and that gets worse as the logo shrinks, both when it scales down on its own and wherever it sits smaller elsewhere on the site. Inside the arc especially, the text is currently too small to read comfortably. Worth revisiting the F's shape and testing it at every size it actually appears at."*</w:t>
+      </w:r>
+    </w:p>
+    <w:p>
+      <w:pPr>
+        <w:spacing w:before="120" w:after="120"/>
+        <w:jc w:val="center"/>
+      </w:pPr>
+      <w:r>
+        <w:rPr>
+          <w:color w:val="BBBBBB"/>
+        </w:rPr>
+        <w:t>――――――――――――――――――――――――――――――</w:t>
+      </w:r>
+    </w:p>
+    <w:p>
+      <w:pPr>
+        <w:pStyle w:val="Heading1"/>
+      </w:pPr>
+      <w:r>
+        <w:rPr>
+          <w:color w:val="1A1A1A"/>
+          <w:sz w:val="30"/>
+        </w:rPr>
+        <w:t>12. Colour palette + fonts</w:t>
+      </w:r>
+    </w:p>
+    <w:p>
+      <w:pPr>
+        <w:pStyle w:val="ListBullet"/>
+      </w:pPr>
+      <w:r>
+        <w:rPr>
+          <w:i/>
+        </w:rPr>
+        <w:t>*Shalaka on palette:</w:t>
+      </w:r>
+      <w:r>
+        <w:rPr>
+          <w:i/>
+        </w:rPr>
+        <w:t xml:space="preserve"> </w:t>
+      </w:r>
+      <w:r>
+        <w:t>"The dot grid backdrop works well, but the palette underneath it needs firming up. The purple currently clashes with the primary cobalt blue rather than sitting alongside it. A clear primary and secondary colour hierarchy would fix this."*</w:t>
+      </w:r>
+    </w:p>
+    <w:p>
+      <w:pPr>
+        <w:pStyle w:val="ListBullet"/>
+      </w:pPr>
+      <w:r>
+        <w:rPr>
+          <w:i/>
+        </w:rPr>
+        <w:t>*Shalaka on the guides page loading state:</w:t>
+      </w:r>
+      <w:r>
+        <w:rPr>
+          <w:i/>
+        </w:rPr>
+        <w:t xml:space="preserve"> </w:t>
+      </w:r>
+      <w:r>
+        <w:t>"On the guides page, the loading animation feels flat for how much space it occupies; better use of white space and font sizing should balance that out."*</w:t>
+      </w:r>
+    </w:p>
+    <w:p>
+      <w:pPr>
+        <w:pStyle w:val="ListBullet"/>
+      </w:pPr>
+      <w:r>
+        <w:rPr>
+          <w:i/>
+        </w:rPr>
+        <w:t>*Shalaka on typography:</w:t>
+      </w:r>
+      <w:r>
+        <w:rPr>
+          <w:i/>
+        </w:rPr>
+        <w:t xml:space="preserve"> </w:t>
+      </w:r>
+      <w:r>
+        <w:t>"The headline font is worth a second look, along with the AI-driven content example."*</w:t>
+      </w:r>
+    </w:p>
+    <w:p>
+      <w:pPr>
+        <w:spacing w:before="120" w:after="120"/>
+        <w:jc w:val="center"/>
+      </w:pPr>
+      <w:r>
+        <w:rPr>
+          <w:color w:val="BBBBBB"/>
+        </w:rPr>
+        <w:t>――――――――――――――――――――――――――――――</w:t>
+      </w:r>
+    </w:p>
+    <w:p>
+      <w:pPr>
+        <w:pStyle w:val="Heading1"/>
+      </w:pPr>
+      <w:r>
+        <w:rPr>
+          <w:color w:val="1A1A1A"/>
+          <w:sz w:val="30"/>
+        </w:rPr>
+        <w:t>13. Contact form — specific bugs and copy notes</w:t>
+      </w:r>
+    </w:p>
+    <w:p>
+      <w:pPr>
+        <w:pStyle w:val="ListBullet"/>
+      </w:pPr>
+      <w:r>
+        <w:rPr>
+          <w:i/>
+        </w:rPr>
+        <w:t>*Shalaka:</w:t>
+      </w:r>
+      <w:r>
+        <w:rPr>
+          <w:i/>
+        </w:rPr>
+        <w:t xml:space="preserve"> </w:t>
+      </w:r>
+      <w:r>
+        <w:t>"'Who are you?' needs more context, something that hints at the kind of answer expected, founder, operator, or VC, and a separate, direct question for the person's name, like 'What should we call you?' The form is smooth to fill out otherwise, but question 7 currently only allows one selection, stuck on 'host an event', when it needs to allow several."*</w:t>
+      </w:r>
+    </w:p>
+    <w:p>
+      <w:pPr>
+        <w:spacing w:before="120" w:after="120"/>
+        <w:jc w:val="center"/>
+      </w:pPr>
+      <w:r>
+        <w:rPr>
+          <w:color w:val="BBBBBB"/>
+        </w:rPr>
+        <w:t>――――――――――――――――――――――――――――――</w:t>
+      </w:r>
+    </w:p>
+    <w:p>
+      <w:pPr>
+        <w:pStyle w:val="Heading1"/>
+      </w:pPr>
+      <w:r>
+        <w:rPr>
+          <w:color w:val="1A1A1A"/>
+          <w:sz w:val="30"/>
+        </w:rPr>
+        <w:t>14. Navigation / scroll length</w:t>
+      </w:r>
+    </w:p>
+    <w:p>
+      <w:pPr>
+        <w:pStyle w:val="ListBullet"/>
+      </w:pPr>
+      <w:r>
+        <w:rPr>
+          <w:i/>
+        </w:rPr>
+        <w:t>*Shalaka:</w:t>
+      </w:r>
+      <w:r>
+        <w:rPr>
+          <w:i/>
+        </w:rPr>
+        <w:t xml:space="preserve"> </w:t>
+      </w:r>
+      <w:r>
+        <w:t>"The scroll to reach the main 'what's next' page runs too long and doesn't feel intuitive. Worth shortening it or breaking it into stages."*</w:t>
+      </w:r>
+    </w:p>
+    <w:p>
+      <w:pPr>
+        <w:spacing w:before="120" w:after="120"/>
+        <w:jc w:val="center"/>
+      </w:pPr>
+      <w:r>
+        <w:rPr>
+          <w:color w:val="BBBBBB"/>
+        </w:rPr>
+        <w:t>――――――――――――――――――――――――――――――</w:t>
+      </w:r>
+    </w:p>
+    <w:p>
+      <w:pPr>
+        <w:pStyle w:val="Heading1"/>
+      </w:pPr>
+      <w:r>
+        <w:rPr>
+          <w:color w:val="1A1A1A"/>
+          <w:sz w:val="30"/>
+        </w:rPr>
+        <w:t>15. Fundraising decks</w:t>
+      </w:r>
+    </w:p>
+    <w:p>
+      <w:pPr>
+        <w:pStyle w:val="ListBullet"/>
+      </w:pPr>
+      <w:r>
+        <w:rPr>
+          <w:i/>
+        </w:rPr>
+        <w:t>*Shalaka:</w:t>
+      </w:r>
+      <w:r>
+        <w:rPr>
+          <w:i/>
+        </w:rPr>
+        <w:t xml:space="preserve"> </w:t>
+      </w:r>
+      <w:r>
+        <w:t>"The fundraising decks idea is a good one, but making all of them public gives away too much; keeping three to five open and gating the rest protects the value."*</w:t>
+      </w:r>
+    </w:p>
+    <w:p>
+      <w:pPr>
+        <w:spacing w:before="120" w:after="120"/>
+        <w:jc w:val="center"/>
+      </w:pPr>
+      <w:r>
+        <w:rPr>
+          <w:color w:val="BBBBBB"/>
+        </w:rPr>
+        <w:t>――――――――――――――――――――――――――――――</w:t>
+      </w:r>
+    </w:p>
+    <w:p>
+      <w:pPr>
+        <w:pStyle w:val="Heading1"/>
+      </w:pPr>
+      <w:r>
+        <w:rPr>
+          <w:color w:val="1A1A1A"/>
+          <w:sz w:val="30"/>
+        </w:rPr>
+        <w:t>16. Community / people page filtering + events page — positive feedback</w:t>
+      </w:r>
+    </w:p>
+    <w:p>
+      <w:pPr>
+        <w:pStyle w:val="ListBullet"/>
+      </w:pPr>
+      <w:r>
+        <w:rPr>
+          <w:i/>
+        </w:rPr>
+        <w:t>*Catch: TFF (Jul 19):</w:t>
+      </w:r>
+      <w:r>
+        <w:rPr>
+          <w:i/>
+        </w:rPr>
+        <w:t xml:space="preserve"> </w:t>
+      </w:r>
+      <w:r>
+        <w:t>"Community page filtering interaction liked: 'Now I like better… because now you can select between two filters.'"*</w:t>
+      </w:r>
+    </w:p>
+    <w:p>
+      <w:pPr>
+        <w:pStyle w:val="ListBullet"/>
+      </w:pPr>
+      <w:r>
+        <w:rPr>
+          <w:i/>
+        </w:rPr>
+        <w:t>*Catch: TFF (Jul 19):</w:t>
+      </w:r>
+      <w:r>
+        <w:rPr>
+          <w:i/>
+        </w:rPr>
+        <w:t xml:space="preserve"> Final events page confirmed as an aggregation page (Luma-style calendar from followed pages / event series). </w:t>
+      </w:r>
+      <w:r>
+        <w:t>"That layout and initial structure looks nice, to be very honest,"</w:t>
       </w:r>
       <w:r>
         <w:rPr>
@@ -1038,31 +1870,7 @@
         <w:t xml:space="preserve"> / </w:t>
       </w:r>
       <w:r>
-        <w:rPr>
-          <w:i/>
-        </w:rPr>
-        <w:t>curated corridor</w:t>
-      </w:r>
-      <w:r>
-        <w:rPr>
-          <w:i/>
-        </w:rPr>
-        <w:t xml:space="preserve"> / </w:t>
-      </w:r>
-      <w:r>
-        <w:rPr>
-          <w:i/>
-        </w:rPr>
-        <w:t>selective</w:t>
-      </w:r>
-      <w:r>
-        <w:rPr>
-          <w:i/>
-        </w:rPr>
-        <w:t xml:space="preserve">. The one sentence that already lands stays. Also: on the application path, prefer simple referral-led wording — Founder Corridor session called out </w:t>
-      </w:r>
-      <w:r>
-        <w:t>"Get a referral from one of your network," "Connect with and convince any of our network"* — and keep only the strongest single path rather than multiple options.</w:t>
+        <w:t>"I love the structure and I love the layout."*</w:t>
       </w:r>
     </w:p>
     <w:p>
@@ -1086,7 +1894,23 @@
           <w:color w:val="1A1A1A"/>
           <w:sz w:val="30"/>
         </w:rPr>
-        <w:t>6. Feature copy should prove, not restate.</w:t>
+        <w:t>17. Positive signals across the site</w:t>
+      </w:r>
+    </w:p>
+    <w:p>
+      <w:pPr>
+        <w:spacing w:after="120"/>
+      </w:pPr>
+      <w:r>
+        <w:t>Bundled here so they're visible alongside the critical feedback.</w:t>
+      </w:r>
+    </w:p>
+    <w:p>
+      <w:pPr>
+        <w:pStyle w:val="ListBullet"/>
+      </w:pPr>
+      <w:r>
+        <w:t>Bangalore → SF hero transition (Mrinali, Siddharth, Ishita).</w:t>
       </w:r>
     </w:p>
     <w:p>
@@ -1097,1094 +1921,24 @@
         <w:rPr>
           <w:i/>
         </w:rPr>
-        <w:t>*Mrinali:</w:t>
-      </w:r>
+        <w:t>"It looks clean. Typography is good."</w:t>
+      </w:r>
+      <w:r>
+        <w:t xml:space="preserve"> (Siddharth)</w:t>
+      </w:r>
+    </w:p>
+    <w:p>
+      <w:pPr>
+        <w:pStyle w:val="ListBullet"/>
+      </w:pPr>
       <w:r>
         <w:rPr>
           <w:i/>
         </w:rPr>
-        <w:t xml:space="preserve"> </w:t>
-      </w:r>
-      <w:r>
-        <w:t>"Right now it is text that explains the title. I want it to be text that confirms the right."*</w:t>
-      </w:r>
-    </w:p>
-    <w:p>
-      <w:pPr>
-        <w:pStyle w:val="ListBullet"/>
-      </w:pPr>
-      <w:r>
-        <w:rPr>
-          <w:i/>
-        </w:rPr>
-        <w:t>*Mrinali:</w:t>
-      </w:r>
-      <w:r>
-        <w:rPr>
-          <w:i/>
-        </w:rPr>
-        <w:t xml:space="preserve"> </w:t>
-      </w:r>
-      <w:r>
-        <w:t>"Playbook to win. What works from those doing it now… you could say, like, we've studied how [XYZ], we know people from XYZ, so we know how to win… it pulls a bigger punch because right now it is text that explains the title."*</w:t>
-      </w:r>
-    </w:p>
-    <w:p>
-      <w:pPr>
-        <w:pStyle w:val="ListBullet"/>
-      </w:pPr>
-      <w:r>
-        <w:rPr>
-          <w:i/>
-        </w:rPr>
-        <w:t>*Mrinali:</w:t>
-      </w:r>
-      <w:r>
-        <w:rPr>
-          <w:i/>
-        </w:rPr>
-        <w:t xml:space="preserve"> </w:t>
-      </w:r>
-      <w:r>
-        <w:t>"Why we are the best people to do it."*</w:t>
-      </w:r>
-    </w:p>
-    <w:p>
-      <w:pPr>
-        <w:pStyle w:val="ListBullet"/>
-      </w:pPr>
-      <w:r>
-        <w:rPr>
-          <w:i/>
-        </w:rPr>
-        <w:t>*Mrinali summary line:</w:t>
-      </w:r>
-      <w:r>
-        <w:rPr>
-          <w:i/>
-        </w:rPr>
-        <w:t xml:space="preserve"> </w:t>
-      </w:r>
-      <w:r>
-        <w:t>"You're showing your rigor in what you're doing. Rather than, you know, talking that, hey, we are doing this."*</w:t>
-      </w:r>
-    </w:p>
-    <w:p>
-      <w:pPr>
-        <w:spacing w:after="120"/>
-      </w:pPr>
-      <w:r>
-        <w:rPr>
-          <w:i/>
-        </w:rPr>
-        <w:t>*Implication:</w:t>
-      </w:r>
-      <w:r>
-        <w:t>* Every capability — investor access, hiring, GTM, playbooks, perks — needs the evidence behind it: relevant experience, network context, outcomes, or specific access patterns. Not "we help with GTM" but "we've done GTM for X, Y, Z, here's what shipped."</w:t>
-      </w:r>
-    </w:p>
-    <w:p>
-      <w:pPr>
-        <w:spacing w:before="120" w:after="120"/>
-        <w:jc w:val="center"/>
-      </w:pPr>
-      <w:r>
-        <w:rPr>
-          <w:color w:val="BBBBBB"/>
-        </w:rPr>
-        <w:t>――――――――――――――――――――――――――――――</w:t>
-      </w:r>
-    </w:p>
-    <w:p>
-      <w:pPr>
-        <w:pStyle w:val="Heading1"/>
-      </w:pPr>
-      <w:r>
-        <w:rPr>
-          <w:color w:val="1A1A1A"/>
-          <w:sz w:val="30"/>
-        </w:rPr>
-        <w:t>7. Founder Concierge is the strongest single proposition. Frame it that way.</w:t>
-      </w:r>
-    </w:p>
-    <w:p>
-      <w:pPr>
-        <w:pStyle w:val="ListBullet"/>
-      </w:pPr>
-      <w:r>
-        <w:rPr>
-          <w:i/>
-        </w:rPr>
-        <w:t>*Balu (Sep 3), unprompted:</w:t>
-      </w:r>
-      <w:r>
-        <w:rPr>
-          <w:i/>
-        </w:rPr>
-        <w:t xml:space="preserve"> </w:t>
-      </w:r>
-      <w:r>
-        <w:t>"Founder concierge as a service is a solid, solid proposition. Like people would pay just for that. Like they'll actually, like, drop a few thousand dollars on you if you can actually just pin that off into a service in itself."*</w:t>
-      </w:r>
-    </w:p>
-    <w:p>
-      <w:pPr>
-        <w:pStyle w:val="ListBullet"/>
-      </w:pPr>
-      <w:r>
-        <w:rPr>
-          <w:i/>
-        </w:rPr>
-        <w:t>*Balu's caveat:</w:t>
-      </w:r>
-      <w:r>
-        <w:rPr>
-          <w:i/>
-        </w:rPr>
-        <w:t xml:space="preserve"> </w:t>
-      </w:r>
-      <w:r>
-        <w:t>"If someone has visited SF even once as a founder or some senior-level operator, then they would see the value of this even more… People have never been to SF simply assume that you can just walk into rooms and then meet everyone that you want. Only when they visit once they would see that. Yeah, you can walk in the rooms and meet people, but not the people you want. You'll just end up meeting, like, a lot of randoms."*</w:t>
-      </w:r>
-    </w:p>
-    <w:p>
-      <w:pPr>
-        <w:pStyle w:val="ListBullet"/>
-      </w:pPr>
-      <w:r>
-        <w:rPr>
-          <w:i/>
-        </w:rPr>
-        <w:t>*Siddharth on the concierge icons:</w:t>
-      </w:r>
-      <w:r>
-        <w:rPr>
-          <w:i/>
-        </w:rPr>
-        <w:t xml:space="preserve"> </w:t>
-      </w:r>
-      <w:r>
-        <w:t>"The only 2 things I can make out is this bridge and this trophy."*</w:t>
-      </w:r>
-    </w:p>
-    <w:p>
-      <w:pPr>
-        <w:spacing w:after="120"/>
-      </w:pPr>
-      <w:r>
-        <w:rPr>
-          <w:i/>
-        </w:rPr>
-        <w:t>*Implication:</w:t>
-      </w:r>
-      <w:r>
-        <w:t>* Concierge deserves to be more prominent and better-substantiated on the page, ideally with an "if you've never been to SF, you don't yet know why this matters" reframe that Balu's quote provides almost verbatim. Rework the concierge icon set so the meaning is legible without hover text.</w:t>
-      </w:r>
-    </w:p>
-    <w:p>
-      <w:pPr>
-        <w:spacing w:before="120" w:after="120"/>
-        <w:jc w:val="center"/>
-      </w:pPr>
-      <w:r>
-        <w:rPr>
-          <w:color w:val="BBBBBB"/>
-        </w:rPr>
-        <w:t>――――――――――――――――――――――――――――――</w:t>
-      </w:r>
-    </w:p>
-    <w:p>
-      <w:pPr>
-        <w:pStyle w:val="Heading1"/>
-      </w:pPr>
-      <w:r>
-        <w:rPr>
-          <w:color w:val="1A1A1A"/>
-          <w:sz w:val="30"/>
-        </w:rPr>
-        <w:t>8. The mission / manifesto is too long and doesn't sound like us.</w:t>
-      </w:r>
-    </w:p>
-    <w:p>
-      <w:pPr>
-        <w:pStyle w:val="ListBullet"/>
-      </w:pPr>
-      <w:r>
-        <w:rPr>
-          <w:i/>
-        </w:rPr>
-        <w:t>*Founder Corridor session:</w:t>
-      </w:r>
-      <w:r>
-        <w:rPr>
-          <w:i/>
-        </w:rPr>
-        <w:t xml:space="preserve"> </w:t>
-      </w:r>
-      <w:r>
-        <w:t>"The written version 'keeps repeating itself' and 'should not be this long at all' — 'it doesn't need like 8 sentences and like it's like a poem.'"*</w:t>
-      </w:r>
-    </w:p>
-    <w:p>
-      <w:pPr>
-        <w:pStyle w:val="ListBullet"/>
-      </w:pPr>
-      <w:r>
-        <w:rPr>
-          <w:i/>
-        </w:rPr>
-        <w:t>*Founder Corridor session:</w:t>
-      </w:r>
-      <w:r>
-        <w:rPr>
-          <w:i/>
-        </w:rPr>
-        <w:t xml:space="preserve"> </w:t>
-      </w:r>
-      <w:r>
-        <w:t>"It's not feeling genuine… it is feeling like you're trying too hard to convince these people that it's good."*</w:t>
-      </w:r>
-    </w:p>
-    <w:p>
-      <w:pPr>
-        <w:pStyle w:val="ListBullet"/>
-      </w:pPr>
-      <w:r>
-        <w:rPr>
-          <w:i/>
-        </w:rPr>
-        <w:t>*Founder Corridor session:</w:t>
-      </w:r>
-      <w:r>
-        <w:rPr>
-          <w:i/>
-        </w:rPr>
-        <w:t xml:space="preserve"> </w:t>
-      </w:r>
-      <w:r>
-        <w:t>"You have to be a little more confident. Optimize for brevity. Just say exactly what you're trying to say."*</w:t>
-      </w:r>
-    </w:p>
-    <w:p>
-      <w:pPr>
-        <w:pStyle w:val="ListBullet"/>
-      </w:pPr>
-      <w:r>
-        <w:rPr>
-          <w:i/>
-        </w:rPr>
-        <w:t>*Founder Corridor session:</w:t>
-      </w:r>
-      <w:r>
-        <w:rPr>
-          <w:i/>
-        </w:rPr>
-        <w:t xml:space="preserve"> </w:t>
-      </w:r>
-      <w:r>
-        <w:t>"The spoken version was preferred over the written copy: 'What you said was so much more clearer to me.'"*</w:t>
-      </w:r>
-    </w:p>
-    <w:p>
-      <w:pPr>
-        <w:pStyle w:val="ListBullet"/>
-      </w:pPr>
-      <w:r>
-        <w:rPr>
-          <w:i/>
-        </w:rPr>
-        <w:t>*Founder Corridor guiding principle:</w:t>
-      </w:r>
-      <w:r>
-        <w:rPr>
-          <w:i/>
-        </w:rPr>
-        <w:t xml:space="preserve"> </w:t>
-      </w:r>
-      <w:r>
-        <w:t>"You have to write like you speak. Only then confidence shows. If you write to impress somebody, it's not going to do that."*</w:t>
-      </w:r>
-    </w:p>
-    <w:p>
-      <w:pPr>
-        <w:pStyle w:val="ListBullet"/>
-      </w:pPr>
-      <w:r>
-        <w:rPr>
-          <w:i/>
-        </w:rPr>
-        <w:t>*Ishita on the same section:</w:t>
-      </w:r>
-      <w:r>
-        <w:rPr>
-          <w:i/>
-        </w:rPr>
-        <w:t xml:space="preserve"> </w:t>
-      </w:r>
-      <w:r>
-        <w:t>"I didn't like the wording of this. Maybe this is cloud generated… I would pick one really crisp angle because I feel like there were two, three different things communicated here,"</w:t>
-      </w:r>
-      <w:r>
-        <w:rPr>
-          <w:i/>
-        </w:rPr>
-        <w:t xml:space="preserve"> and </w:t>
-      </w:r>
-      <w:r>
-        <w:t>"There wasn't a message that kind of stayed in my head. Maybe make it crisper."*</w:t>
-      </w:r>
-    </w:p>
-    <w:p>
-      <w:pPr>
-        <w:pStyle w:val="ListBullet"/>
-      </w:pPr>
-      <w:r>
-        <w:rPr>
-          <w:i/>
-        </w:rPr>
-        <w:t>*Ishita on the framing option:</w:t>
-      </w:r>
-      <w:r>
-        <w:rPr>
-          <w:i/>
-        </w:rPr>
-        <w:t xml:space="preserve"> </w:t>
-      </w:r>
-      <w:r>
-        <w:t>"This will look like a scroll or a letter. Right. So this is more on here. This is like the memo that comes out in the beginning… why are we doing what we're doing? And it'll look like a written handwritten thing, basically."* Direction if you go that way: keep it short so the message actually lands.</w:t>
-      </w:r>
-    </w:p>
-    <w:p>
-      <w:pPr>
-        <w:pStyle w:val="ListBullet"/>
-      </w:pPr>
-      <w:r>
-        <w:rPr>
-          <w:i/>
-        </w:rPr>
-        <w:t>*Shalaka:</w:t>
-      </w:r>
-      <w:r>
-        <w:rPr>
-          <w:i/>
-        </w:rPr>
-        <w:t xml:space="preserve"> </w:t>
-      </w:r>
-      <w:r>
-        <w:t>"The 'Building looks exciting from the outside' section could be tightened; there's more content than the point needs,"</w:t>
-      </w:r>
-      <w:r>
-        <w:rPr>
-          <w:i/>
-        </w:rPr>
-        <w:t xml:space="preserve"> and </w:t>
-      </w:r>
-      <w:r>
-        <w:t>"'Steal the structure, not the slides' is a strong line and worth building on further."*</w:t>
-      </w:r>
-    </w:p>
-    <w:p>
-      <w:pPr>
-        <w:spacing w:after="120"/>
-      </w:pPr>
-      <w:r>
-        <w:rPr>
-          <w:i/>
-        </w:rPr>
-        <w:t>*Implication:</w:t>
-      </w:r>
-      <w:r>
-        <w:t>* Cut mission copy to a fraction of its current length. Sharpen to one clear angle. Read every sentence aloud — if it sounds like a script and not a founder speaking, rewrite it. "Steal the structure, not the slides" survives; the poem-like paragraph doesn't.</w:t>
-      </w:r>
-    </w:p>
-    <w:p>
-      <w:pPr>
-        <w:spacing w:before="120" w:after="120"/>
-        <w:jc w:val="center"/>
-      </w:pPr>
-      <w:r>
-        <w:rPr>
-          <w:color w:val="BBBBBB"/>
-        </w:rPr>
-        <w:t>――――――――――――――――――――――――――――――</w:t>
-      </w:r>
-    </w:p>
-    <w:p>
-      <w:pPr>
-        <w:pStyle w:val="Heading1"/>
-      </w:pPr>
-      <w:r>
-        <w:rPr>
-          <w:color w:val="1A1A1A"/>
-          <w:sz w:val="30"/>
-        </w:rPr>
-        <w:t>9. Wider AI-generated tone concern across the site.</w:t>
-      </w:r>
-    </w:p>
-    <w:p>
-      <w:pPr>
-        <w:pStyle w:val="ListBullet"/>
-      </w:pPr>
-      <w:r>
-        <w:rPr>
-          <w:i/>
-        </w:rPr>
-        <w:t>*Catch: TFF (Jul 19):</w:t>
-      </w:r>
-      <w:r>
-        <w:rPr>
-          <w:i/>
-        </w:rPr>
-        <w:t xml:space="preserve"> </w:t>
-      </w:r>
-      <w:r>
-        <w:t>"Website copy is largely AI-generated; repeated worry: 'If it's just AI generated content, how valuable will it be?'"* Needs humanizing using different sources — Twitter bookmarks were shared via WhatsApp as raw material.</w:t>
-      </w:r>
-    </w:p>
-    <w:p>
-      <w:pPr>
-        <w:spacing w:after="120"/>
-      </w:pPr>
-      <w:r>
-        <w:rPr>
-          <w:i/>
-        </w:rPr>
-        <w:t>*Implication:</w:t>
-      </w:r>
-      <w:r>
-        <w:t>* The same voice / humanizer pass that's being applied to the playbook needs to hit the main site too. Any section that reads like a chatbot summary needs re-writing from raw human sources (interviews, Twitter threads, meeting notes).</w:t>
-      </w:r>
-    </w:p>
-    <w:p>
-      <w:pPr>
-        <w:spacing w:before="120" w:after="120"/>
-        <w:jc w:val="center"/>
-      </w:pPr>
-      <w:r>
-        <w:rPr>
-          <w:color w:val="BBBBBB"/>
-        </w:rPr>
-        <w:t>――――――――――――――――――――――――――――――</w:t>
-      </w:r>
-    </w:p>
-    <w:p>
-      <w:pPr>
-        <w:pStyle w:val="Heading1"/>
-      </w:pPr>
-      <w:r>
-        <w:rPr>
-          <w:color w:val="1A1A1A"/>
-          <w:sz w:val="30"/>
-        </w:rPr>
-        <w:t>10. Sections and structure the homepage should surface.</w:t>
-      </w:r>
-    </w:p>
-    <w:p>
-      <w:pPr>
-        <w:pStyle w:val="ListBullet"/>
-      </w:pPr>
-      <w:r>
-        <w:rPr>
-          <w:i/>
-        </w:rPr>
-        <w:t>*Siddharth:</w:t>
-      </w:r>
-      <w:r>
-        <w:rPr>
-          <w:i/>
-        </w:rPr>
-        <w:t xml:space="preserve"> Surface the </w:t>
-      </w:r>
-      <w:r>
-        <w:rPr>
-          <w:i/>
-        </w:rPr>
-        <w:t>"before going to SF / after arriving"</w:t>
-      </w:r>
-      <w:r>
-        <w:rPr>
-          <w:i/>
-        </w:rPr>
-        <w:t xml:space="preserve"> split — three items each — directly on the homepage (he was specifically asked and explicitly said </w:t>
-      </w:r>
-      <w:r>
-        <w:t>"Homepage"</w:t>
-      </w:r>
-      <w:r>
-        <w:rPr>
-          <w:i/>
-        </w:rPr>
-        <w:t xml:space="preserve"> was where this belongs). Cover the biggest practical problems like housing and community so a founder can quickly judge </w:t>
-      </w:r>
-      <w:r>
-        <w:t>"is this useful to me or not?"*</w:t>
-      </w:r>
-    </w:p>
-    <w:p>
-      <w:pPr>
-        <w:pStyle w:val="ListBullet"/>
-      </w:pPr>
-      <w:r>
-        <w:rPr>
-          <w:i/>
-        </w:rPr>
-        <w:t>*Siddharth:</w:t>
-      </w:r>
-      <w:r>
-        <w:rPr>
-          <w:i/>
-        </w:rPr>
-        <w:t xml:space="preserve"> </w:t>
-      </w:r>
-      <w:r>
-        <w:t>"Make the experience reassuring for nervous first-time visitors to the US."*</w:t>
-      </w:r>
-    </w:p>
-    <w:p>
-      <w:pPr>
-        <w:pStyle w:val="ListBullet"/>
-      </w:pPr>
-      <w:r>
-        <w:rPr>
-          <w:i/>
-        </w:rPr>
-        <w:t>*Siddharth blunt verdict:</w:t>
-      </w:r>
-      <w:r>
-        <w:rPr>
-          <w:i/>
-        </w:rPr>
-        <w:t xml:space="preserve"> </w:t>
-      </w:r>
-      <w:r>
-        <w:t>"Our deck is more beautiful."* The current website falls short of the deck.</w:t>
-      </w:r>
-    </w:p>
-    <w:p>
-      <w:pPr>
-        <w:pStyle w:val="ListBullet"/>
-      </w:pPr>
-      <w:r>
-        <w:rPr>
-          <w:i/>
-        </w:rPr>
-        <w:t>*Ishita on the six-buckets / concierge section:</w:t>
-      </w:r>
-      <w:r>
-        <w:rPr>
-          <w:i/>
-        </w:rPr>
-        <w:t xml:space="preserve"> </w:t>
-      </w:r>
-      <w:r>
-        <w:t>"You could break it down here if, you know, you think this is also not clear enough."*</w:t>
-      </w:r>
-    </w:p>
-    <w:p>
-      <w:pPr>
-        <w:pStyle w:val="ListBullet"/>
-      </w:pPr>
-      <w:r>
-        <w:rPr>
-          <w:i/>
-        </w:rPr>
-        <w:t>*Ishita on the "support" wording:</w:t>
-      </w:r>
-      <w:r>
-        <w:rPr>
-          <w:i/>
-        </w:rPr>
-        <w:t xml:space="preserve"> </w:t>
-      </w:r>
-      <w:r>
-        <w:t>"Support seems to generate. Like, what do you mean support with…"* — the word "support" is doing too much work without specifics.</w:t>
-      </w:r>
-    </w:p>
-    <w:p>
-      <w:pPr>
-        <w:spacing w:after="120"/>
-      </w:pPr>
-      <w:r>
-        <w:rPr>
-          <w:i/>
-        </w:rPr>
-        <w:t>*Implication:</w:t>
-      </w:r>
-      <w:r>
-        <w:t>* Add a lightweight before-you-fly / after-you-land split on the homepage with three concrete items each — housing, community, whatever else is highest-value — so a first-time visitor can qualify themselves in ten seconds. Replace "support" with a specific verb wherever it appears.</w:t>
-      </w:r>
-    </w:p>
-    <w:p>
-      <w:pPr>
-        <w:spacing w:before="120" w:after="120"/>
-        <w:jc w:val="center"/>
-      </w:pPr>
-      <w:r>
-        <w:rPr>
-          <w:color w:val="BBBBBB"/>
-        </w:rPr>
-        <w:t>――――――――――――――――――――――――――――――</w:t>
-      </w:r>
-    </w:p>
-    <w:p>
-      <w:pPr>
-        <w:pStyle w:val="Heading1"/>
-      </w:pPr>
-      <w:r>
-        <w:rPr>
-          <w:color w:val="1A1A1A"/>
-          <w:sz w:val="30"/>
-        </w:rPr>
-        <w:t>11. Logo animation is loved but needs to hold up at every size.</w:t>
-      </w:r>
-    </w:p>
-    <w:p>
-      <w:pPr>
-        <w:pStyle w:val="ListBullet"/>
-      </w:pPr>
-      <w:r>
-        <w:rPr>
-          <w:i/>
-        </w:rPr>
-        <w:t>*Shalaka:</w:t>
-      </w:r>
-      <w:r>
-        <w:rPr>
-          <w:i/>
-        </w:rPr>
-        <w:t xml:space="preserve"> </w:t>
-      </w:r>
-      <w:r>
-        <w:t>"The animation itself is lovely, but the F is hard to read once it's moving, and that gets worse as the logo shrinks, both when it scales down on its own and wherever it sits smaller elsewhere on the site. Inside the arc especially, the text is currently too small to read comfortably. Worth revisiting the F's shape and testing it at every size it actually appears at."*</w:t>
-      </w:r>
-    </w:p>
-    <w:p>
-      <w:pPr>
-        <w:spacing w:after="120"/>
-      </w:pPr>
-      <w:r>
-        <w:rPr>
-          <w:i/>
-        </w:rPr>
-        <w:t>*Implication:</w:t>
-      </w:r>
-      <w:r>
-        <w:t>* Revisit the F glyph so it survives shrinkage. Ship an audit of every place the logo appears (header, favicon, footer, guides page, arc treatment) at actual rendered sizes.</w:t>
-      </w:r>
-    </w:p>
-    <w:p>
-      <w:pPr>
-        <w:spacing w:before="120" w:after="120"/>
-        <w:jc w:val="center"/>
-      </w:pPr>
-      <w:r>
-        <w:rPr>
-          <w:color w:val="BBBBBB"/>
-        </w:rPr>
-        <w:t>――――――――――――――――――――――――――――――</w:t>
-      </w:r>
-    </w:p>
-    <w:p>
-      <w:pPr>
-        <w:pStyle w:val="Heading1"/>
-      </w:pPr>
-      <w:r>
-        <w:rPr>
-          <w:color w:val="1A1A1A"/>
-          <w:sz w:val="30"/>
-        </w:rPr>
-        <w:t>12. Colour palette + fonts.</w:t>
-      </w:r>
-    </w:p>
-    <w:p>
-      <w:pPr>
-        <w:pStyle w:val="ListBullet"/>
-      </w:pPr>
-      <w:r>
-        <w:rPr>
-          <w:i/>
-        </w:rPr>
-        <w:t>*Shalaka on palette:</w:t>
-      </w:r>
-      <w:r>
-        <w:rPr>
-          <w:i/>
-        </w:rPr>
-        <w:t xml:space="preserve"> </w:t>
-      </w:r>
-      <w:r>
-        <w:t>"The dot grid backdrop works well, but the palette underneath it needs firming up. The purple currently clashes with the primary cobalt blue rather than sitting alongside it. A clear primary and secondary colour hierarchy would fix this."*</w:t>
-      </w:r>
-    </w:p>
-    <w:p>
-      <w:pPr>
-        <w:pStyle w:val="ListBullet"/>
-      </w:pPr>
-      <w:r>
-        <w:rPr>
-          <w:i/>
-        </w:rPr>
-        <w:t>*Shalaka on the guides page loading state:</w:t>
-      </w:r>
-      <w:r>
-        <w:rPr>
-          <w:i/>
-        </w:rPr>
-        <w:t xml:space="preserve"> </w:t>
-      </w:r>
-      <w:r>
-        <w:t>"On the guides page, the loading animation feels flat for how much space it occupies; better use of white space and font sizing should balance that out."*</w:t>
-      </w:r>
-    </w:p>
-    <w:p>
-      <w:pPr>
-        <w:pStyle w:val="ListBullet"/>
-      </w:pPr>
-      <w:r>
-        <w:rPr>
-          <w:i/>
-        </w:rPr>
-        <w:t>*Shalaka on typography:</w:t>
-      </w:r>
-      <w:r>
-        <w:rPr>
-          <w:i/>
-        </w:rPr>
-        <w:t xml:space="preserve"> </w:t>
-      </w:r>
-      <w:r>
-        <w:t>"The headline font is worth a second look, along with the AI-driven content example."*</w:t>
-      </w:r>
-    </w:p>
-    <w:p>
-      <w:pPr>
-        <w:spacing w:after="120"/>
-      </w:pPr>
-      <w:r>
-        <w:rPr>
-          <w:i/>
-        </w:rPr>
-        <w:t>*Implication:</w:t>
-      </w:r>
-      <w:r>
-        <w:t>* Lock in a primary colour and demote the purple to a clear secondary role (or drop it). Redesign the guides-page loading state so it doesn't sit dead in the middle of a large area. Sanity-check the headline font at scale.</w:t>
-      </w:r>
-    </w:p>
-    <w:p>
-      <w:pPr>
-        <w:spacing w:before="120" w:after="120"/>
-        <w:jc w:val="center"/>
-      </w:pPr>
-      <w:r>
-        <w:rPr>
-          <w:color w:val="BBBBBB"/>
-        </w:rPr>
-        <w:t>――――――――――――――――――――――――――――――</w:t>
-      </w:r>
-    </w:p>
-    <w:p>
-      <w:pPr>
-        <w:pStyle w:val="Heading1"/>
-      </w:pPr>
-      <w:r>
-        <w:rPr>
-          <w:color w:val="1A1A1A"/>
-          <w:sz w:val="30"/>
-        </w:rPr>
-        <w:t>13. Contact form has real bugs.</w:t>
-      </w:r>
-    </w:p>
-    <w:p>
-      <w:pPr>
-        <w:pStyle w:val="ListBullet"/>
-      </w:pPr>
-      <w:r>
-        <w:rPr>
-          <w:i/>
-        </w:rPr>
-        <w:t>*Shalaka:</w:t>
-      </w:r>
-      <w:r>
-        <w:rPr>
-          <w:i/>
-        </w:rPr>
-        <w:t xml:space="preserve"> </w:t>
-      </w:r>
-      <w:r>
-        <w:t>"'Who are you?' needs more context, something that hints at the kind of answer expected, founder, operator, or VC, and a separate, direct question for the person's name, like 'What should we call you?' The form is smooth to fill out otherwise, but question 7 currently only allows one selection, stuck on 'host an event', when it needs to allow several."*</w:t>
-      </w:r>
-    </w:p>
-    <w:p>
-      <w:pPr>
-        <w:spacing w:after="120"/>
-      </w:pPr>
-      <w:r>
-        <w:rPr>
-          <w:i/>
-        </w:rPr>
-        <w:t>*Implication:</w:t>
-      </w:r>
-      <w:r>
-        <w:t>* Two fixes: (a) reword "Who are you?" with example choices (founder / operator / VC) and split the name question out into its own field. (b) Question 7 should be multi-select; it currently locks to "host an event." This is a shipped bug on a form real people are trying to submit.</w:t>
-      </w:r>
-    </w:p>
-    <w:p>
-      <w:pPr>
-        <w:spacing w:before="120" w:after="120"/>
-        <w:jc w:val="center"/>
-      </w:pPr>
-      <w:r>
-        <w:rPr>
-          <w:color w:val="BBBBBB"/>
-        </w:rPr>
-        <w:t>――――――――――――――――――――――――――――――</w:t>
-      </w:r>
-    </w:p>
-    <w:p>
-      <w:pPr>
-        <w:pStyle w:val="Heading1"/>
-      </w:pPr>
-      <w:r>
-        <w:rPr>
-          <w:color w:val="1A1A1A"/>
-          <w:sz w:val="30"/>
-        </w:rPr>
-        <w:t>14. Navigation / scroll length.</w:t>
-      </w:r>
-    </w:p>
-    <w:p>
-      <w:pPr>
-        <w:pStyle w:val="ListBullet"/>
-      </w:pPr>
-      <w:r>
-        <w:rPr>
-          <w:i/>
-        </w:rPr>
-        <w:t>*Shalaka:</w:t>
-      </w:r>
-      <w:r>
-        <w:rPr>
-          <w:i/>
-        </w:rPr>
-        <w:t xml:space="preserve"> </w:t>
-      </w:r>
-      <w:r>
-        <w:t>"The scroll to reach the main 'what's next' page runs too long and doesn't feel intuitive. Worth shortening it or breaking it into stages."*</w:t>
-      </w:r>
-    </w:p>
-    <w:p>
-      <w:pPr>
-        <w:spacing w:after="120"/>
-      </w:pPr>
-      <w:r>
-        <w:rPr>
-          <w:i/>
-        </w:rPr>
-        <w:t>*Implication:</w:t>
-      </w:r>
-      <w:r>
-        <w:t>* Either shorten the top-of-site scroll before the next section starts, or break it up with clearer visual staging so the visitor knows they're progressing.</w:t>
-      </w:r>
-    </w:p>
-    <w:p>
-      <w:pPr>
-        <w:spacing w:before="120" w:after="120"/>
-        <w:jc w:val="center"/>
-      </w:pPr>
-      <w:r>
-        <w:rPr>
-          <w:color w:val="BBBBBB"/>
-        </w:rPr>
-        <w:t>――――――――――――――――――――――――――――――</w:t>
-      </w:r>
-    </w:p>
-    <w:p>
-      <w:pPr>
-        <w:pStyle w:val="Heading1"/>
-      </w:pPr>
-      <w:r>
-        <w:rPr>
-          <w:color w:val="1A1A1A"/>
-          <w:sz w:val="30"/>
-        </w:rPr>
-        <w:t>15. Fundraising decks: gate most of them.</w:t>
-      </w:r>
-    </w:p>
-    <w:p>
-      <w:pPr>
-        <w:pStyle w:val="ListBullet"/>
-      </w:pPr>
-      <w:r>
-        <w:rPr>
-          <w:i/>
-        </w:rPr>
-        <w:t>*Shalaka:</w:t>
-      </w:r>
-      <w:r>
-        <w:rPr>
-          <w:i/>
-        </w:rPr>
-        <w:t xml:space="preserve"> </w:t>
-      </w:r>
-      <w:r>
-        <w:t>"The fundraising decks idea is a good one, but making all of them public gives away too much; keeping three to five open and gating the rest protects the value."*</w:t>
-      </w:r>
-    </w:p>
-    <w:p>
-      <w:pPr>
-        <w:spacing w:after="120"/>
-      </w:pPr>
-      <w:r>
-        <w:rPr>
-          <w:i/>
-        </w:rPr>
-        <w:t>*Implication:</w:t>
-      </w:r>
-      <w:r>
-        <w:t>* Open 3–5 decks. Gate the rest behind email or membership. Preserves scarcity and gives us a data-capture path in the process.</w:t>
-      </w:r>
-    </w:p>
-    <w:p>
-      <w:pPr>
-        <w:spacing w:before="120" w:after="120"/>
-        <w:jc w:val="center"/>
-      </w:pPr>
-      <w:r>
-        <w:rPr>
-          <w:color w:val="BBBBBB"/>
-        </w:rPr>
-        <w:t>――――――――――――――――――――――――――――――</w:t>
-      </w:r>
-    </w:p>
-    <w:p>
-      <w:pPr>
-        <w:pStyle w:val="Heading1"/>
-      </w:pPr>
-      <w:r>
-        <w:rPr>
-          <w:color w:val="1A1A1A"/>
-          <w:sz w:val="30"/>
-        </w:rPr>
-        <w:t>16. Community / people page filtering is working — keep it.</w:t>
-      </w:r>
-    </w:p>
-    <w:p>
-      <w:pPr>
-        <w:pStyle w:val="ListBullet"/>
-      </w:pPr>
-      <w:r>
-        <w:rPr>
-          <w:i/>
-        </w:rPr>
-        <w:t>*Catch: TFF (Jul 19):</w:t>
-      </w:r>
-      <w:r>
-        <w:rPr>
-          <w:i/>
-        </w:rPr>
-        <w:t xml:space="preserve"> </w:t>
-      </w:r>
-      <w:r>
-        <w:t>"Community page filtering interaction liked: 'Now I like better… because now you can select between two filters.'"*</w:t>
-      </w:r>
-    </w:p>
-    <w:p>
-      <w:pPr>
-        <w:pStyle w:val="ListBullet"/>
-      </w:pPr>
-      <w:r>
-        <w:rPr>
-          <w:i/>
-        </w:rPr>
-        <w:t>*Catch: TFF (Jul 19):</w:t>
-      </w:r>
-      <w:r>
-        <w:rPr>
-          <w:i/>
-        </w:rPr>
-        <w:t xml:space="preserve"> Final "events" page confirmed as an aggregation page (Luma-style calendar from followed pages / event series). </w:t>
-      </w:r>
-      <w:r>
-        <w:t>"That layout and initial structure looks nice, to be very honest,"</w:t>
-      </w:r>
-      <w:r>
-        <w:rPr>
-          <w:i/>
-        </w:rPr>
-        <w:t xml:space="preserve"> / </w:t>
-      </w:r>
-      <w:r>
-        <w:t>"I love the structure and I love the layout."*</w:t>
-      </w:r>
-    </w:p>
-    <w:p>
-      <w:pPr>
-        <w:spacing w:after="120"/>
-      </w:pPr>
-      <w:r>
-        <w:rPr>
-          <w:i/>
-        </w:rPr>
-        <w:t>*Implication:</w:t>
-      </w:r>
-      <w:r>
-        <w:t>* Don't touch what works. Whatever the filtering interaction on the community page is, keep the interaction pattern. Same for the events / calendar aggregation page — the structure has been validated.</w:t>
-      </w:r>
-    </w:p>
-    <w:p>
-      <w:pPr>
-        <w:spacing w:before="120" w:after="120"/>
-        <w:jc w:val="center"/>
-      </w:pPr>
-      <w:r>
-        <w:rPr>
-          <w:color w:val="BBBBBB"/>
-        </w:rPr>
-        <w:t>――――――――――――――――――――――――――――――</w:t>
-      </w:r>
-    </w:p>
-    <w:p>
-      <w:pPr>
-        <w:pStyle w:val="Heading1"/>
-      </w:pPr>
-      <w:r>
-        <w:rPr>
-          <w:color w:val="1A1A1A"/>
-          <w:sz w:val="30"/>
-        </w:rPr>
-        <w:t>17. Positive signals — don't lose these in the rewrite.</w:t>
-      </w:r>
-    </w:p>
-    <w:p>
-      <w:pPr>
-        <w:spacing w:after="120"/>
-      </w:pPr>
-      <w:r>
-        <w:t>Bundled here so they don't get accidentally cut in the next pass.</w:t>
-      </w:r>
-    </w:p>
-    <w:p>
-      <w:pPr>
-        <w:pStyle w:val="ListBullet"/>
-      </w:pPr>
-      <w:r>
-        <w:t>Bangalore → SF hero transition (Mrinali, Siddharth, Ishita).</w:t>
-      </w:r>
-    </w:p>
-    <w:p>
-      <w:pPr>
-        <w:pStyle w:val="ListBullet"/>
-      </w:pPr>
-      <w:r>
-        <w:t>"It looks clean. Typography is good." (Siddharth)</w:t>
-      </w:r>
-    </w:p>
-    <w:p>
-      <w:pPr>
-        <w:pStyle w:val="ListBullet"/>
-      </w:pPr>
-      <w:r>
-        <w:t xml:space="preserve">"An exclusive community of founders, on both sides of the Pacific" — one line Shalaka said to </w:t>
+        <w:t>"An exclusive community of founders, on both sides of the Pacific"</w:t>
+      </w:r>
+      <w:r>
+        <w:t xml:space="preserve"> — Shalaka called this out as one line to </w:t>
       </w:r>
       <w:r>
         <w:rPr>
@@ -2201,7 +1955,13 @@
         <w:pStyle w:val="ListBullet"/>
       </w:pPr>
       <w:r>
-        <w:t>"Steal the structure, not the slides" — worth building on further (Shalaka).</w:t>
+        <w:rPr>
+          <w:i/>
+        </w:rPr>
+        <w:t>"Steal the structure, not the slides"</w:t>
+      </w:r>
+      <w:r>
+        <w:t xml:space="preserve"> — worth building on further (Shalaka).</w:t>
       </w:r>
     </w:p>
     <w:p>
@@ -2209,7 +1969,13 @@
         <w:pStyle w:val="ListBullet"/>
       </w:pPr>
       <w:r>
-        <w:t>General "The founder concierge, the way it's phrased and the general messaging in general is very good" (Balu).</w:t>
+        <w:rPr>
+          <w:i/>
+        </w:rPr>
+        <w:t>"The founder concierge, the way it's phrased and the general messaging in general is very good."</w:t>
+      </w:r>
+      <w:r>
+        <w:t xml:space="preserve"> (Balu)</w:t>
       </w:r>
     </w:p>
     <w:p>
@@ -2217,7 +1983,13 @@
         <w:pStyle w:val="ListBullet"/>
       </w:pPr>
       <w:r>
-        <w:t>"This is really, really good for V1. This is very, very polished for V1." (Ishita).</w:t>
+        <w:rPr>
+          <w:i/>
+        </w:rPr>
+        <w:t>"This is really, really good for V1. This is very, very polished for V1."</w:t>
+      </w:r>
+      <w:r>
+        <w:t xml:space="preserve"> (Ishita)</w:t>
       </w:r>
     </w:p>
     <w:p>
@@ -2226,86 +1998,6 @@
       </w:pPr>
       <w:r>
         <w:t>Community page filtering + events page structure (Catch: TFF).</w:t>
-      </w:r>
-    </w:p>
-    <w:p>
-      <w:pPr>
-        <w:spacing w:before="120" w:after="120"/>
-        <w:jc w:val="center"/>
-      </w:pPr>
-      <w:r>
-        <w:rPr>
-          <w:color w:val="BBBBBB"/>
-        </w:rPr>
-        <w:t>――――――――――――――――――――――――――――――</w:t>
-      </w:r>
-    </w:p>
-    <w:p>
-      <w:pPr>
-        <w:pStyle w:val="Heading1"/>
-      </w:pPr>
-      <w:r>
-        <w:rPr>
-          <w:color w:val="1A1A1A"/>
-          <w:sz w:val="30"/>
-        </w:rPr>
-        <w:t>Priority read (not a request from Arnob, just where I'd start)</w:t>
-      </w:r>
-    </w:p>
-    <w:p>
-      <w:pPr>
-        <w:pStyle w:val="ListNumber"/>
-      </w:pPr>
-      <w:r>
-        <w:t>Rewrite hero copy per §2 (lead with the transformation).</w:t>
-      </w:r>
-    </w:p>
-    <w:p>
-      <w:pPr>
-        <w:pStyle w:val="ListNumber"/>
-      </w:pPr>
-      <w:r>
-        <w:t>Add credibility strip per §3 (Suhas, Product Folks, network — logos + names).</w:t>
-      </w:r>
-    </w:p>
-    <w:p>
-      <w:pPr>
-        <w:pStyle w:val="ListNumber"/>
-      </w:pPr>
-      <w:r>
-        <w:t>Add scarcity signal per §4 ("5 of 20 spots filled").</w:t>
-      </w:r>
-    </w:p>
-    <w:p>
-      <w:pPr>
-        <w:pStyle w:val="ListNumber"/>
-      </w:pPr>
-      <w:r>
-        <w:t>Fix the contact form multi-select bug + rename "Who are you?" per §13.</w:t>
-      </w:r>
-    </w:p>
-    <w:p>
-      <w:pPr>
-        <w:pStyle w:val="ListNumber"/>
-      </w:pPr>
-      <w:r>
-        <w:t>Cut mission copy per §8.</w:t>
-      </w:r>
-    </w:p>
-    <w:p>
-      <w:pPr>
-        <w:pStyle w:val="ListNumber"/>
-      </w:pPr>
-      <w:r>
-        <w:t>Then work through logo scaling (§11), palette hierarchy (§12), and sticky-scroll pacing + plane visual (§1).</w:t>
-      </w:r>
-    </w:p>
-    <w:p>
-      <w:pPr>
-        <w:spacing w:after="120"/>
-      </w:pPr>
-      <w:r>
-        <w:t>Everything else is polish. Ship 1–5 fast and the site becomes a different piece of work.</w:t>
       </w:r>
     </w:p>
     <w:sectPr>

</xml_diff>